<commit_message>
Improve open source review workflow
</commit_message>
<xml_diff>
--- a/outputs/weekly/semantic_communication_report_2026-W20.docx
+++ b/outputs/weekly/semantic_communication_report_2026-W20.docx
@@ -22,7 +22,17 @@
     </w:p>
     <w:p>
       <w:r>
-        <w:t>开源论文数：0</w:t>
+        <w:t>已确认开源论文数：0</w:t>
+      </w:r>
+    </w:p>
+    <w:p>
+      <w:r>
+        <w:t>待人工复核候选数：0</w:t>
+      </w:r>
+    </w:p>
+    <w:p>
+      <w:r>
+        <w:t>自动未发现代码数：11</w:t>
       </w:r>
     </w:p>
     <w:p>
@@ -319,52 +329,52 @@
     </w:p>
     <w:p>
       <w:r>
-        <w:t>Joint Optimization of Hovering Position and Resource Allocation in UAV-Enabled Semantic Communications via Greedy-Enhanced Adaptive Cellular Genetic Algorithm（2026）｜6G / 无线通信｜Optimization / Resource Allocation｜相关性 13.5</w:t>
-      </w:r>
-    </w:p>
-    <w:p>
-      <w:r>
-        <w:t>Not All Symbols Are Equal: Importance-Aware Constellation Design for Semantic Communication（2026）｜任务导向通信｜Semantic-Aware Physical Layer｜相关性 9.5</w:t>
-      </w:r>
-    </w:p>
-    <w:p>
-      <w:r>
-        <w:t>When Semantic Communication Meets Queueing: Cross-Layer Latency and Task Fidelity Optimization（2026）｜6G / 无线通信｜Optimization / Resource Allocation｜相关性 8.0</w:t>
-      </w:r>
-    </w:p>
-    <w:p>
-      <w:r>
-        <w:t>Research on Multi-Agent Semantic Communication Framework Based on Comparative Learning Joint Optimization（2026）｜LLM / Agent 辅助语义通信｜Multi-Agent｜相关性 7.5</w:t>
-      </w:r>
-    </w:p>
-    <w:p>
-      <w:r>
-        <w:t>Semantic Communication with an LLM-enabled Knowledge Base（2026）｜LLM / Agent 辅助语义通信｜Foundation Model / LLM｜相关性 7.5</w:t>
-      </w:r>
-    </w:p>
-    <w:p>
-      <w:r>
-        <w:t>Joint Communication and Computation Design for Mobile Embodied AI Network (MEAN)（2026）｜6G / 无线通信｜Optimization / Resource Allocation｜相关性 7.0</w:t>
-      </w:r>
-    </w:p>
-    <w:p>
-      <w:r>
-        <w:t>Adaptive Dual-Path Framework for Covert Semantic Communication（2026）｜任务导向通信｜Semantic-Aware Physical Layer｜相关性 7.0</w:t>
-      </w:r>
-    </w:p>
-    <w:p>
-      <w:r>
-        <w:t>Spacing-Based Coupling Radiation Control in Pinching-Antennas Systems for Heterogeneous NOMA Users（2026）｜6G / 无线通信｜Semantic-Aware Physical Layer｜相关性 7.0</w:t>
-      </w:r>
-    </w:p>
-    <w:p>
-      <w:r>
-        <w:t>Waveguide to Meaning: Semantic-Aware NOMA for Pinching-Antenna Systems（2026）｜6G / 无线通信｜Semantic-Aware Physical Layer｜相关性 7.0</w:t>
-      </w:r>
-    </w:p>
-    <w:p>
-      <w:r>
-        <w:t>Toward Communication-Efficient Space Data Centers: Bottlenecks, Architectures, and New Paradigms（2026）｜LLM / Agent 辅助语义通信｜Foundation Model / LLM｜相关性 6.5</w:t>
+        <w:t>Joint Optimization of Hovering Position and Resource Allocation in UAV-Enabled Semantic Communications via Greedy-Enhanced Adaptive Cellular Genetic Algorithm（2026）｜6G / 无线通信｜Optimization / Resource Allocation｜相关性 13.5｜not_detected</w:t>
+      </w:r>
+    </w:p>
+    <w:p>
+      <w:r>
+        <w:t>Not All Symbols Are Equal: Importance-Aware Constellation Design for Semantic Communication（2026）｜任务导向通信｜Semantic-Aware Physical Layer｜相关性 9.5｜not_detected</w:t>
+      </w:r>
+    </w:p>
+    <w:p>
+      <w:r>
+        <w:t>When Semantic Communication Meets Queueing: Cross-Layer Latency and Task Fidelity Optimization（2026）｜6G / 无线通信｜Optimization / Resource Allocation｜相关性 8.0｜not_detected</w:t>
+      </w:r>
+    </w:p>
+    <w:p>
+      <w:r>
+        <w:t>Research on Multi-Agent Semantic Communication Framework Based on Comparative Learning Joint Optimization（2026）｜LLM / Agent 辅助语义通信｜Multi-Agent｜相关性 7.5｜not_detected</w:t>
+      </w:r>
+    </w:p>
+    <w:p>
+      <w:r>
+        <w:t>Semantic Communication with an LLM-enabled Knowledge Base（2026）｜LLM / Agent 辅助语义通信｜Foundation Model / LLM｜相关性 7.5｜not_detected</w:t>
+      </w:r>
+    </w:p>
+    <w:p>
+      <w:r>
+        <w:t>Joint Communication and Computation Design for Mobile Embodied AI Network (MEAN)（2026）｜6G / 无线通信｜Optimization / Resource Allocation｜相关性 7.0｜not_detected</w:t>
+      </w:r>
+    </w:p>
+    <w:p>
+      <w:r>
+        <w:t>Adaptive Dual-Path Framework for Covert Semantic Communication（2026）｜任务导向通信｜Semantic-Aware Physical Layer｜相关性 7.0｜not_detected</w:t>
+      </w:r>
+    </w:p>
+    <w:p>
+      <w:r>
+        <w:t>Spacing-Based Coupling Radiation Control in Pinching-Antennas Systems for Heterogeneous NOMA Users（2026）｜6G / 无线通信｜Semantic-Aware Physical Layer｜相关性 7.0｜not_detected</w:t>
+      </w:r>
+    </w:p>
+    <w:p>
+      <w:r>
+        <w:t>Waveguide to Meaning: Semantic-Aware NOMA for Pinching-Antenna Systems（2026）｜6G / 无线通信｜Semantic-Aware Physical Layer｜相关性 7.0｜not_detected</w:t>
+      </w:r>
+    </w:p>
+    <w:p>
+      <w:r>
+        <w:t>Toward Communication-Efficient Space Data Centers: Bottlenecks, Architectures, and New Paradigms（2026）｜LLM / Agent 辅助语义通信｜Foundation Model / LLM｜相关性 6.5｜not_detected</w:t>
       </w:r>
     </w:p>
     <w:p>
@@ -464,7 +474,7 @@
           </w:tcPr>
           <w:p>
             <w:r>
-              <w:t>开源</w:t>
+              <w:t>开源状态</w:t>
             </w:r>
           </w:p>
         </w:tc>
@@ -536,7 +546,7 @@
           </w:tcPr>
           <w:p>
             <w:r>
-              <w:t>未发现</w:t>
+              <w:t>not_detected</w:t>
             </w:r>
           </w:p>
         </w:tc>
@@ -608,7 +618,7 @@
           </w:tcPr>
           <w:p>
             <w:r>
-              <w:t>未发现</w:t>
+              <w:t>not_detected</w:t>
             </w:r>
           </w:p>
         </w:tc>
@@ -680,7 +690,7 @@
           </w:tcPr>
           <w:p>
             <w:r>
-              <w:t>未发现</w:t>
+              <w:t>not_detected</w:t>
             </w:r>
           </w:p>
         </w:tc>
@@ -752,7 +762,7 @@
           </w:tcPr>
           <w:p>
             <w:r>
-              <w:t>未发现</w:t>
+              <w:t>not_detected</w:t>
             </w:r>
           </w:p>
         </w:tc>
@@ -824,7 +834,7 @@
           </w:tcPr>
           <w:p>
             <w:r>
-              <w:t>未发现</w:t>
+              <w:t>not_detected</w:t>
             </w:r>
           </w:p>
         </w:tc>
@@ -896,7 +906,7 @@
           </w:tcPr>
           <w:p>
             <w:r>
-              <w:t>未发现</w:t>
+              <w:t>not_detected</w:t>
             </w:r>
           </w:p>
         </w:tc>
@@ -968,7 +978,7 @@
           </w:tcPr>
           <w:p>
             <w:r>
-              <w:t>未发现</w:t>
+              <w:t>not_detected</w:t>
             </w:r>
           </w:p>
         </w:tc>
@@ -1040,7 +1050,7 @@
           </w:tcPr>
           <w:p>
             <w:r>
-              <w:t>未发现</w:t>
+              <w:t>not_detected</w:t>
             </w:r>
           </w:p>
         </w:tc>
@@ -1112,7 +1122,7 @@
           </w:tcPr>
           <w:p>
             <w:r>
-              <w:t>未发现</w:t>
+              <w:t>not_detected</w:t>
             </w:r>
           </w:p>
         </w:tc>
@@ -1184,7 +1194,7 @@
           </w:tcPr>
           <w:p>
             <w:r>
-              <w:t>未发现</w:t>
+              <w:t>not_detected</w:t>
             </w:r>
           </w:p>
         </w:tc>
@@ -1256,7 +1266,7 @@
           </w:tcPr>
           <w:p>
             <w:r>
-              <w:t>未发现</w:t>
+              <w:t>not_detected</w:t>
             </w:r>
           </w:p>
         </w:tc>
@@ -1267,12 +1277,117 @@
         <w:pStyle w:val="Heading1"/>
       </w:pPr>
       <w:r>
-        <w:t>五、开源情况</w:t>
-      </w:r>
-    </w:p>
-    <w:p>
-      <w:r>
-        <w:t>本次 curated 论文中暂未检测到明确代码仓库链接，后续可人工补充项目主页或 GitHub 仓库。</w:t>
+        <w:t>五、开源复核清单</w:t>
+      </w:r>
+    </w:p>
+    <w:p>
+      <w:r>
+        <w:t>## 开源复核清单</w:t>
+      </w:r>
+    </w:p>
+    <w:p>
+      <w:r>
+        <w:t/>
+      </w:r>
+    </w:p>
+    <w:p>
+      <w:r>
+        <w:t>说明：not_detected 只表示自动流程未发现明确代码链接，不等于论文一定未开源。</w:t>
+      </w:r>
+    </w:p>
+    <w:p>
+      <w:r>
+        <w:t/>
+      </w:r>
+    </w:p>
+    <w:p>
+      <w:r>
+        <w:t>### 已确认开源</w:t>
+      </w:r>
+    </w:p>
+    <w:p>
+      <w:r>
+        <w:t>- 本次 curated 论文中暂未检测到高可信代码仓库链接。</w:t>
+      </w:r>
+    </w:p>
+    <w:p>
+      <w:r>
+        <w:t/>
+      </w:r>
+    </w:p>
+    <w:p>
+      <w:r>
+        <w:t>### 需要人工复核</w:t>
+      </w:r>
+    </w:p>
+    <w:p>
+      <w:r>
+        <w:t>- 本次没有需要人工复核的候选链接。</w:t>
+      </w:r>
+    </w:p>
+    <w:p>
+      <w:r>
+        <w:t/>
+      </w:r>
+    </w:p>
+    <w:p>
+      <w:r>
+        <w:t>### 自动未发现</w:t>
+      </w:r>
+    </w:p>
+    <w:p>
+      <w:r>
+        <w:t>- Joint Optimization of Hovering Position and Resource Allocation in UAV-Enabled Semantic Communications via Greedy-Enhanced Adaptive Cellular Genetic Algorithm (2026) | evidence=source_error:papers_with_code;source_error:pdf_link_extract</w:t>
+      </w:r>
+    </w:p>
+    <w:p>
+      <w:r>
+        <w:t>- Not All Symbols Are Equal: Importance-Aware Constellation Design for Semantic Communication (2026) | evidence=source_error:papers_with_code</w:t>
+      </w:r>
+    </w:p>
+    <w:p>
+      <w:r>
+        <w:t>- When Semantic Communication Meets Queueing: Cross-Layer Latency and Task Fidelity Optimization (2026) | evidence=source_error:papers_with_code;source_error:github_search</w:t>
+      </w:r>
+    </w:p>
+    <w:p>
+      <w:r>
+        <w:t>- Research on Multi-Agent Semantic Communication Framework Based on Comparative Learning Joint Optimization (2026) | evidence=source_error:papers_with_code;source_error:pdf_link_extract</w:t>
+      </w:r>
+    </w:p>
+    <w:p>
+      <w:r>
+        <w:t>- Semantic Communication with an LLM-enabled Knowledge Base (2026) | evidence=source_error:papers_with_code;source_error:github_search</w:t>
+      </w:r>
+    </w:p>
+    <w:p>
+      <w:r>
+        <w:t>- Joint Communication and Computation Design for Mobile Embodied AI Network (MEAN) (2026) | evidence=source_error:papers_with_code</w:t>
+      </w:r>
+    </w:p>
+    <w:p>
+      <w:r>
+        <w:t>- Adaptive Dual-Path Framework for Covert Semantic Communication (2026) | evidence=source_error:papers_with_code;source_error:github_search</w:t>
+      </w:r>
+    </w:p>
+    <w:p>
+      <w:r>
+        <w:t>- Spacing-Based Coupling Radiation Control in Pinching-Antennas Systems for Heterogeneous NOMA Users (2026) | evidence=source_error:papers_with_code</w:t>
+      </w:r>
+    </w:p>
+    <w:p>
+      <w:r>
+        <w:t>- Waveguide to Meaning: Semantic-Aware NOMA for Pinching-Antenna Systems (2026) | evidence=source_error:papers_with_code;source_error:github_search</w:t>
+      </w:r>
+    </w:p>
+    <w:p>
+      <w:r>
+        <w:t>- Toward Communication-Efficient Space Data Centers: Bottlenecks, Architectures, and New Paradigms (2026) | evidence=source_error:papers_with_code</w:t>
+      </w:r>
+    </w:p>
+    <w:p>
+      <w:r>
+        <w:t>- Semantic Channel Theory: Deductive Compression and Structural Fidelity for Multi-Agent Communication (2026) | evidence=source_error:papers_with_code;source_error:github_search</w:t>
       </w:r>
     </w:p>
     <w:sectPr/>

</xml_diff>